<commit_message>
fix: resolve SonarQube issues added detailed readme File
Resolved the remaining SonarQube reliability, maintainability, security, and accessibility issues.

Added and updated tests to improve code coverage and meet the SonarQube quality gate requirements.

Added a detailed README covering project features, technology stack, project structure, prerequisites, environment configuration, installation, running the frontend and backend, testing, coverage, SonarQube analysis, and Postman API testing.

Added the Postman test collection and related files for testing the authentication and notes APIs.
</commit_message>
<xml_diff>
--- a/docs/SonarCube Report.docx
+++ b/docs/SonarCube Report.docx
@@ -78,7 +78,7 @@
                 <w:sz w:val="72"/>
                 <w:lang w:val="en-US"/>
               </w:rPr>
-              <w:t>notes-app-local</w:t>
+              <w:t>Notes App</w:t>
             </w:r>
           </w:p>
           <w:p>
@@ -274,7 +274,7 @@
                 <w:b/>
                 <w:lang w:val="en-US"/>
               </w:rPr>
-              <w:t>2026-08-28</w:t>
+              <w:t>2026-08-30</w:t>
             </w:r>
           </w:p>
           <w:p>
@@ -292,7 +292,7 @@
                 <w:b/>
                 <w:lang w:val="en-US"/>
               </w:rPr>
-              <w:t>Analyzed the : 2026-08-28</w:t>
+              <w:t>Analyzed the : 2026-08-30</w:t>
             </w:r>
             <w:bookmarkStart w:id="1" w:name="_GoBack"/>
             <w:bookmarkEnd w:id="1"/>
@@ -1731,7 +1731,7 @@
         <w:rPr>
           <w:lang w:val="en-US"/>
         </w:rPr>
-        <w:t xml:space="preserve"> notes-app-local.</w:t>
+        <w:t xml:space="preserve"> Notes App.</w:t>
       </w:r>
     </w:p>
     <w:p>
@@ -2010,12 +2010,12 @@
               <w:drawing>
                 <wp:inline distT="0" distR="0" distB="0" distL="0">
                   <wp:extent cx="304800" cy="304800"/>
-                  <wp:docPr id="0" name="Drawing 0" descr="B.png"/>
+                  <wp:docPr id="0" name="Drawing 0" descr="A.png"/>
                   <a:graphic xmlns:a="http://schemas.openxmlformats.org/drawingml/2006/main">
                     <a:graphicData uri="http://schemas.openxmlformats.org/drawingml/2006/picture">
                       <pic:pic xmlns:pic="http://schemas.openxmlformats.org/drawingml/2006/picture">
                         <pic:nvPicPr>
-                          <pic:cNvPr id="0" name="Picture 0" descr="B.png"/>
+                          <pic:cNvPr id="0" name="Picture 0" descr="A.png"/>
                           <pic:cNvPicPr>
                             <a:picLocks noChangeAspect="true"/>
                           </pic:cNvPicPr>
@@ -2069,12 +2069,12 @@
               <w:drawing>
                 <wp:inline distT="0" distR="0" distB="0" distL="0">
                   <wp:extent cx="304800" cy="304800"/>
-                  <wp:docPr id="4" name="Drawing 4" descr="B.png"/>
+                  <wp:docPr id="4" name="Drawing 4" descr="A.png"/>
                   <a:graphic xmlns:a="http://schemas.openxmlformats.org/drawingml/2006/main">
                     <a:graphicData uri="http://schemas.openxmlformats.org/drawingml/2006/picture">
                       <pic:pic xmlns:pic="http://schemas.openxmlformats.org/drawingml/2006/picture">
                         <pic:nvPicPr>
-                          <pic:cNvPr id="0" name="Picture 4" descr="B.png"/>
+                          <pic:cNvPr id="0" name="Picture 4" descr="A.png"/>
                           <pic:cNvPicPr>
                             <a:picLocks noChangeAspect="true"/>
                           </pic:cNvPicPr>
@@ -2139,7 +2139,7 @@
                           </pic:cNvPicPr>
                         </pic:nvPicPr>
                         <pic:blipFill>
-                          <a:blip r:embed="rId17"/>
+                          <a:blip r:embed="rId16"/>
                           <a:stretch>
                             <a:fillRect/>
                           </a:stretch>
@@ -2198,7 +2198,7 @@
                           </pic:cNvPicPr>
                         </pic:nvPicPr>
                         <pic:blipFill>
-                          <a:blip r:embed="rId17"/>
+                          <a:blip r:embed="rId16"/>
                           <a:stretch>
                             <a:fillRect/>
                           </a:stretch>
@@ -2326,7 +2326,7 @@
                           </pic:cNvPicPr>
                         </pic:nvPicPr>
                         <pic:blipFill>
-                          <a:blip r:embed="rId18"/>
+                          <a:blip r:embed="rId17"/>
                           <a:stretch>
                             <a:fillRect/>
                           </a:stretch>
@@ -2403,22 +2403,6 @@
           <w:p>
             <w:r>
               <w:t>Duplicated Lines (%) on New Code</w:t>
-            </w:r>
-          </w:p>
-        </w:tc>
-        <w:tc>
-          <w:p>
-            <w:r>
-              <w:t>OK</w:t>
-            </w:r>
-          </w:p>
-        </w:tc>
-      </w:tr>
-      <w:tr>
-        <w:tc>
-          <w:p>
-            <w:r>
-              <w:t>Security Hotspots Reviewed on New Code</w:t>
             </w:r>
           </w:p>
         </w:tc>
@@ -2610,7 +2594,7 @@
               <w:rPr>
                 <w:szCs w:val="24"/>
               </w:rPr>
-              <w:t>80.7 %</w:t>
+              <w:t>85.1 %</w:t>
             </w:r>
           </w:p>
         </w:tc>
@@ -2662,7 +2646,7 @@
                 <w:bCs/>
                 <w:szCs w:val="24"/>
               </w:rPr>
-              <w:t>6.9 %</w:t>
+              <w:t>6.6 %</w:t>
             </w:r>
           </w:p>
         </w:tc>
@@ -2685,7 +2669,7 @@
                 <w:b/>
                 <w:lang w:val="en-US"/>
               </w:rPr>
-              <w:t>53.0</w:t>
+              <w:t>63.5</w:t>
             </w:r>
           </w:p>
         </w:tc>
@@ -2708,7 +2692,7 @@
                 <w:b/>
                 <w:lang w:val="en-US"/>
               </w:rPr>
-              <w:t>99.6</w:t>
+              <w:t>100.0</w:t>
             </w:r>
             <w:r>
               <w:rPr>
@@ -3026,28 +3010,28 @@
         <w:tc>
           <w:p>
             <w:r>
-              <w:t>0d 0h 15min</w:t>
-            </w:r>
-          </w:p>
-        </w:tc>
-        <w:tc>
-          <w:p>
-            <w:r>
-              <w:t>0d 4h 35min</w:t>
-            </w:r>
-          </w:p>
-        </w:tc>
-        <w:tc>
-          <w:p>
-            <w:r>
-              <w:t>0d 2h 1min</w:t>
-            </w:r>
-          </w:p>
-        </w:tc>
-        <w:tc>
-          <w:p>
-            <w:r>
-              <w:t>0d 6h 51min</w:t>
+              <w:t>-</w:t>
+            </w:r>
+          </w:p>
+        </w:tc>
+        <w:tc>
+          <w:p>
+            <w:r>
+              <w:t>-</w:t>
+            </w:r>
+          </w:p>
+        </w:tc>
+        <w:tc>
+          <w:p>
+            <w:r>
+              <w:t>-</w:t>
+            </w:r>
+          </w:p>
+        </w:tc>
+        <w:tc>
+          <w:p>
+            <w:r>
+              <w:t>-</w:t>
             </w:r>
           </w:p>
         </w:tc>
@@ -3421,7 +3405,7 @@
               <w:cnfStyle w:val="000000000000" w:firstRow="0" w:lastRow="0" w:firstColumn="0" w:lastColumn="0" w:oddVBand="0" w:evenVBand="0" w:oddHBand="0" w:evenHBand="0" w:firstRowFirstColumn="0" w:firstRowLastColumn="0" w:lastRowFirstColumn="0" w:lastRowLastColumn="0"/>
             </w:pPr>
             <w:r>
-              <w:t>205.0</w:t>
+              <w:t>213.0</w:t>
             </w:r>
           </w:p>
         </w:tc>
@@ -3437,7 +3421,7 @@
               <w:cnfStyle w:val="000000000000" w:firstRow="0" w:lastRow="0" w:firstColumn="0" w:lastColumn="0" w:oddVBand="0" w:evenVBand="0" w:oddHBand="0" w:evenHBand="0" w:firstRowFirstColumn="0" w:firstRowLastColumn="0" w:lastRowFirstColumn="0" w:lastRowLastColumn="0"/>
             </w:pPr>
             <w:r>
-              <w:t>92.0</w:t>
+              <w:t>96.0</w:t>
             </w:r>
           </w:p>
         </w:tc>
@@ -3453,7 +3437,7 @@
               <w:cnfStyle w:val="000000000000" w:firstRow="0" w:lastRow="0" w:firstColumn="0" w:lastColumn="0" w:oddVBand="0" w:evenVBand="0" w:oddHBand="0" w:evenHBand="0" w:firstRowFirstColumn="0" w:firstRowLastColumn="0" w:lastRowFirstColumn="0" w:lastRowLastColumn="0"/>
             </w:pPr>
             <w:r>
-              <w:t>3329.0</w:t>
+              <w:t>3380.0</w:t>
             </w:r>
           </w:p>
         </w:tc>
@@ -3469,7 +3453,7 @@
               <w:cnfStyle w:val="000000000000" w:firstRow="0" w:lastRow="0" w:firstColumn="0" w:lastColumn="0" w:oddVBand="0" w:evenVBand="0" w:oddHBand="0" w:evenHBand="0" w:firstRowFirstColumn="0" w:firstRowLastColumn="0" w:lastRowFirstColumn="0" w:lastRowLastColumn="0"/>
             </w:pPr>
             <w:r>
-              <w:t>39.6</w:t>
+              <w:t>17.8</w:t>
             </w:r>
           </w:p>
         </w:tc>
@@ -3574,7 +3558,7 @@
         <w:tc>
           <w:p>
             <w:r>
-              <w:t>1971</w:t>
+              <w:t>1992</w:t>
             </w:r>
           </w:p>
         </w:tc>
@@ -3590,7 +3574,7 @@
         <w:tc>
           <w:p>
             <w:r>
-              <w:t>1865</w:t>
+              <w:t>1869</w:t>
             </w:r>
           </w:p>
         </w:tc>
@@ -3606,7 +3590,7 @@
         <w:tc>
           <w:p>
             <w:r>
-              <w:t>3836</w:t>
+              <w:t>3861</w:t>
             </w:r>
           </w:p>
         </w:tc>
@@ -3945,7 +3929,7 @@
         <w:tc>
           <w:p>
             <w:r>
-              <w:t>3</w:t>
+              <w:t>0</w:t>
             </w:r>
           </w:p>
         </w:tc>
@@ -3989,7 +3973,7 @@
         <w:tc>
           <w:p>
             <w:r>
-              <w:t>3</w:t>
+              <w:t>0</w:t>
             </w:r>
           </w:p>
         </w:tc>
@@ -4033,14 +4017,14 @@
         <w:tc>
           <w:p>
             <w:r>
-              <w:t>11</w:t>
-            </w:r>
-          </w:p>
-        </w:tc>
-        <w:tc>
-          <w:p>
-            <w:r>
-              <w:t>9</w:t>
+              <w:t>0</w:t>
+            </w:r>
+          </w:p>
+        </w:tc>
+        <w:tc>
+          <w:p>
+            <w:r>
+              <w:t>0</w:t>
             </w:r>
           </w:p>
         </w:tc>
@@ -4112,524 +4096,6 @@
       <w:tblGrid>
         <w:gridCol w:w="9854"/>
       </w:tblGrid>
-      <w:tr>
-        <w:tc>
-          <w:p>
-            <w:r>
-              <w:t>Name</w:t>
-            </w:r>
-          </w:p>
-        </w:tc>
-        <w:tc>
-          <w:p>
-            <w:r>
-              <w:t>Description</w:t>
-            </w:r>
-          </w:p>
-        </w:tc>
-        <w:tc>
-          <w:p>
-            <w:r>
-              <w:t>Type</w:t>
-            </w:r>
-          </w:p>
-        </w:tc>
-        <w:tc>
-          <w:p>
-            <w:r>
-              <w:t>Severity</w:t>
-            </w:r>
-          </w:p>
-        </w:tc>
-        <w:tc>
-          <w:p>
-            <w:r>
-              <w:t>Number</w:t>
-            </w:r>
-          </w:p>
-        </w:tc>
-      </w:tr>
-      <w:tr>
-        <w:tc>
-          <w:p>
-            <w:r>
-              <w:t>Mouse events should have corresponding keyboard events</w:t>
-            </w:r>
-          </w:p>
-        </w:tc>
-        <w:tc>
-          <w:p>
-            <w:r>
-              <w:t/>
-            </w:r>
-          </w:p>
-        </w:tc>
-        <w:tc>
-          <w:p>
-            <w:r>
-              <w:t>BUG</w:t>
-            </w:r>
-          </w:p>
-        </w:tc>
-        <w:tc>
-          <w:p>
-            <w:r>
-              <w:t>MINOR</w:t>
-            </w:r>
-          </w:p>
-        </w:tc>
-        <w:tc>
-          <w:p>
-            <w:r>
-              <w:t>3</w:t>
-            </w:r>
-          </w:p>
-        </w:tc>
-      </w:tr>
-      <w:tr>
-        <w:tc>
-          <w:p>
-            <w:r>
-              <w:t>React Context Provider values should have stable identities</w:t>
-            </w:r>
-          </w:p>
-        </w:tc>
-        <w:tc>
-          <w:p>
-            <w:r>
-              <w:t/>
-            </w:r>
-          </w:p>
-        </w:tc>
-        <w:tc>
-          <w:p>
-            <w:r>
-              <w:t>CODE_SMELL</w:t>
-            </w:r>
-          </w:p>
-        </w:tc>
-        <w:tc>
-          <w:p>
-            <w:r>
-              <w:t>MAJOR</w:t>
-            </w:r>
-          </w:p>
-        </w:tc>
-        <w:tc>
-          <w:p>
-            <w:r>
-              <w:t>1</w:t>
-            </w:r>
-          </w:p>
-        </w:tc>
-      </w:tr>
-      <w:tr>
-        <w:tc>
-          <w:p>
-            <w:r>
-              <w:t>Spacing between inline elements should be explicit</w:t>
-            </w:r>
-          </w:p>
-        </w:tc>
-        <w:tc>
-          <w:p>
-            <w:r>
-              <w:t/>
-            </w:r>
-          </w:p>
-        </w:tc>
-        <w:tc>
-          <w:p>
-            <w:r>
-              <w:t>CODE_SMELL</w:t>
-            </w:r>
-          </w:p>
-        </w:tc>
-        <w:tc>
-          <w:p>
-            <w:r>
-              <w:t>MAJOR</w:t>
-            </w:r>
-          </w:p>
-        </w:tc>
-        <w:tc>
-          <w:p>
-            <w:r>
-              <w:t>2</w:t>
-            </w:r>
-          </w:p>
-        </w:tc>
-      </w:tr>
-      <w:tr>
-        <w:tc>
-          <w:p>
-            <w:r>
-              <w:t>Prefer tag over ARIA role</w:t>
-            </w:r>
-          </w:p>
-        </w:tc>
-        <w:tc>
-          <w:p>
-            <w:r>
-              <w:t/>
-            </w:r>
-          </w:p>
-        </w:tc>
-        <w:tc>
-          <w:p>
-            <w:r>
-              <w:t>CODE_SMELL</w:t>
-            </w:r>
-          </w:p>
-        </w:tc>
-        <w:tc>
-          <w:p>
-            <w:r>
-              <w:t>MAJOR</w:t>
-            </w:r>
-          </w:p>
-        </w:tc>
-        <w:tc>
-          <w:p>
-            <w:r>
-              <w:t>4</w:t>
-            </w:r>
-          </w:p>
-        </w:tc>
-      </w:tr>
-      <w:tr>
-        <w:tc>
-          <w:p>
-            <w:r>
-              <w:t>Non-interactive DOM elements should not have interactive ARIA roles</w:t>
-            </w:r>
-          </w:p>
-        </w:tc>
-        <w:tc>
-          <w:p>
-            <w:r>
-              <w:t/>
-            </w:r>
-          </w:p>
-        </w:tc>
-        <w:tc>
-          <w:p>
-            <w:r>
-              <w:t>CODE_SMELL</w:t>
-            </w:r>
-          </w:p>
-        </w:tc>
-        <w:tc>
-          <w:p>
-            <w:r>
-              <w:t>MAJOR</w:t>
-            </w:r>
-          </w:p>
-        </w:tc>
-        <w:tc>
-          <w:p>
-            <w:r>
-              <w:t>1</w:t>
-            </w:r>
-          </w:p>
-        </w:tc>
-      </w:tr>
-      <w:tr>
-        <w:tc>
-          <w:p>
-            <w:r>
-              <w:t>Non-interactive DOM elements should not have an interactive handler</w:t>
-            </w:r>
-          </w:p>
-        </w:tc>
-        <w:tc>
-          <w:p>
-            <w:r>
-              <w:t/>
-            </w:r>
-          </w:p>
-        </w:tc>
-        <w:tc>
-          <w:p>
-            <w:r>
-              <w:t>CODE_SMELL</w:t>
-            </w:r>
-          </w:p>
-        </w:tc>
-        <w:tc>
-          <w:p>
-            <w:r>
-              <w:t>MAJOR</w:t>
-            </w:r>
-          </w:p>
-        </w:tc>
-        <w:tc>
-          <w:p>
-            <w:r>
-              <w:t>1</w:t>
-            </w:r>
-          </w:p>
-        </w:tc>
-      </w:tr>
-      <w:tr>
-        <w:tc>
-          <w:p>
-            <w:r>
-              <w:t>Regular expressions should not cause non-linear backtracking</w:t>
-            </w:r>
-          </w:p>
-        </w:tc>
-        <w:tc>
-          <w:p>
-            <w:r>
-              <w:t/>
-            </w:r>
-          </w:p>
-        </w:tc>
-        <w:tc>
-          <w:p>
-            <w:r>
-              <w:t>CODE_SMELL</w:t>
-            </w:r>
-          </w:p>
-        </w:tc>
-        <w:tc>
-          <w:p>
-            <w:r>
-              <w:t>MAJOR</w:t>
-            </w:r>
-          </w:p>
-        </w:tc>
-        <w:tc>
-          <w:p>
-            <w:r>
-              <w:t>2</w:t>
-            </w:r>
-          </w:p>
-        </w:tc>
-      </w:tr>
-      <w:tr>
-        <w:tc>
-          <w:p>
-            <w:r>
-              <w:t>"&lt;button&gt;" elements should have an explicit "type" attribute</w:t>
-            </w:r>
-          </w:p>
-        </w:tc>
-        <w:tc>
-          <w:p>
-            <w:r>
-              <w:t/>
-            </w:r>
-          </w:p>
-        </w:tc>
-        <w:tc>
-          <w:p>
-            <w:r>
-              <w:t>CODE_SMELL</w:t>
-            </w:r>
-          </w:p>
-        </w:tc>
-        <w:tc>
-          <w:p>
-            <w:r>
-              <w:t>MAJOR</w:t>
-            </w:r>
-          </w:p>
-        </w:tc>
-        <w:tc>
-          <w:p>
-            <w:r>
-              <w:t>3</w:t>
-            </w:r>
-          </w:p>
-        </w:tc>
-      </w:tr>
-      <w:tr>
-        <w:tc>
-          <w:p>
-            <w:r>
-              <w:t>Optional chaining should be preferred</w:t>
-            </w:r>
-          </w:p>
-        </w:tc>
-        <w:tc>
-          <w:p>
-            <w:r>
-              <w:t/>
-            </w:r>
-          </w:p>
-        </w:tc>
-        <w:tc>
-          <w:p>
-            <w:r>
-              <w:t>CODE_SMELL</w:t>
-            </w:r>
-          </w:p>
-        </w:tc>
-        <w:tc>
-          <w:p>
-            <w:r>
-              <w:t>MINOR</w:t>
-            </w:r>
-          </w:p>
-        </w:tc>
-        <w:tc>
-          <w:p>
-            <w:r>
-              <w:t>4</w:t>
-            </w:r>
-          </w:p>
-        </w:tc>
-      </w:tr>
-      <w:tr>
-        <w:tc>
-          <w:p>
-            <w:r>
-              <w:t>Node.js built-in modules should be imported using the "node:" protocol</w:t>
-            </w:r>
-          </w:p>
-        </w:tc>
-        <w:tc>
-          <w:p>
-            <w:r>
-              <w:t/>
-            </w:r>
-          </w:p>
-        </w:tc>
-        <w:tc>
-          <w:p>
-            <w:r>
-              <w:t>CODE_SMELL</w:t>
-            </w:r>
-          </w:p>
-        </w:tc>
-        <w:tc>
-          <w:p>
-            <w:r>
-              <w:t>MINOR</w:t>
-            </w:r>
-          </w:p>
-        </w:tc>
-        <w:tc>
-          <w:p>
-            <w:r>
-              <w:t>2</w:t>
-            </w:r>
-          </w:p>
-        </w:tc>
-      </w:tr>
-      <w:tr>
-        <w:tc>
-          <w:p>
-            <w:r>
-              <w:t>Regular expressions should not cause catastrophic backtracking</w:t>
-            </w:r>
-          </w:p>
-        </w:tc>
-        <w:tc>
-          <w:p>
-            <w:r>
-              <w:t/>
-            </w:r>
-          </w:p>
-        </w:tc>
-        <w:tc>
-          <w:p>
-            <w:r>
-              <w:t>VULNERABILITY</w:t>
-            </w:r>
-          </w:p>
-        </w:tc>
-        <w:tc>
-          <w:p>
-            <w:r>
-              <w:t>CRITICAL</w:t>
-            </w:r>
-          </w:p>
-        </w:tc>
-        <w:tc>
-          <w:p>
-            <w:r>
-              <w:t>1</w:t>
-            </w:r>
-          </w:p>
-        </w:tc>
-      </w:tr>
-      <w:tr>
-        <w:tc>
-          <w:p>
-            <w:r>
-              <w:t>Cross-Origin Resource Sharing (CORS) policy should be restricted to trusted origins</w:t>
-            </w:r>
-          </w:p>
-        </w:tc>
-        <w:tc>
-          <w:p>
-            <w:r>
-              <w:t/>
-            </w:r>
-          </w:p>
-        </w:tc>
-        <w:tc>
-          <w:p>
-            <w:r>
-              <w:t>VULNERABILITY</w:t>
-            </w:r>
-          </w:p>
-        </w:tc>
-        <w:tc>
-          <w:p>
-            <w:r>
-              <w:t>MAJOR</w:t>
-            </w:r>
-          </w:p>
-        </w:tc>
-        <w:tc>
-          <w:p>
-            <w:r>
-              <w:t>1</w:t>
-            </w:r>
-          </w:p>
-        </w:tc>
-      </w:tr>
-      <w:tr>
-        <w:tc>
-          <w:p>
-            <w:r>
-              <w:t>Web application technologies should not disclose version information</w:t>
-            </w:r>
-          </w:p>
-        </w:tc>
-        <w:tc>
-          <w:p>
-            <w:r>
-              <w:t/>
-            </w:r>
-          </w:p>
-        </w:tc>
-        <w:tc>
-          <w:p>
-            <w:r>
-              <w:t>VULNERABILITY</w:t>
-            </w:r>
-          </w:p>
-        </w:tc>
-        <w:tc>
-          <w:p>
-            <w:r>
-              <w:t>MINOR</w:t>
-            </w:r>
-          </w:p>
-        </w:tc>
-        <w:tc>
-          <w:p>
-            <w:r>
-              <w:t>1</w:t>
-            </w:r>
-          </w:p>
-        </w:tc>
-      </w:tr>
     </w:tbl>
     <w:p>
       <w:pPr>
@@ -5774,7 +5240,7 @@
       <w:jc w:val="left"/>
     </w:pPr>
     <w:r>
-      <w:t>notes-app-local</w:t>
+      <w:t>Notes App</w:t>
     </w:r>
   </w:p>
 </w:hdr>
@@ -9238,10 +8704,10 @@
                   <c:v>0</c:v>
                 </c:pt>
                 <c:pt idx="2">
-                  <c:v>9</c:v>
+                  <c:v>0</c:v>
                 </c:pt>
                 <c:pt idx="3">
-                  <c:v>17</c:v>
+                  <c:v>0</c:v>
                 </c:pt>
                 <c:pt idx="4">
                   <c:v>0</c:v>
@@ -9468,13 +8934,13 @@
                 <c:formatCode>General</c:formatCode>
                 <c:ptCount val="3"/>
                 <c:pt idx="0">
-                  <c:v>3</c:v>
+                  <c:v>0</c:v>
                 </c:pt>
                 <c:pt idx="1">
-                  <c:v>3</c:v>
+                  <c:v>0</c:v>
                 </c:pt>
                 <c:pt idx="2">
-                  <c:v>20</c:v>
+                  <c:v>0</c:v>
                 </c:pt>
               </c:numCache>
             </c:numRef>
@@ -9649,10 +9115,22 @@
                 <c:formatCode>dd/mm/yyyy\ hh:mm</c:formatCode>
                 <c:ptCount val="2"/>
                 <c:pt idx="0">
-                  <c:v>46262.04824074074</c:v>
+                  <c:v>46262.03627314815</c:v>
                 </c:pt>
                 <c:pt idx="1">
-                  <c:v>46262.061215277776</c:v>
+                  <c:v>46264.81765046297</c:v>
+                </c:pt>
+                <c:pt idx="2">
+                  <c:v>46264.8278125</c:v>
+                </c:pt>
+                <c:pt idx="3">
+                  <c:v>46264.83329861111</c:v>
+                </c:pt>
+                <c:pt idx="4">
+                  <c:v>46264.84984953704</c:v>
+                </c:pt>
+                <c:pt idx="5">
+                  <c:v>46264.85894675926</c:v>
                 </c:pt>
               </c:numCache>
             </c:numRef>
@@ -9667,7 +9145,19 @@
                   <c:v>26</c:v>
                 </c:pt>
                 <c:pt idx="1">
-                  <c:v>26</c:v>
+                  <c:v>22</c:v>
+                </c:pt>
+                <c:pt idx="2">
+                  <c:v>2</c:v>
+                </c:pt>
+                <c:pt idx="3">
+                  <c:v>1</c:v>
+                </c:pt>
+                <c:pt idx="4">
+                  <c:v>1</c:v>
+                </c:pt>
+                <c:pt idx="5">
+                  <c:v>0</c:v>
                 </c:pt>
               </c:numCache>
             </c:numRef>
@@ -9965,10 +9455,22 @@
                 <c:formatCode>dd/mm/yyyy\ hh:mm</c:formatCode>
                 <c:ptCount val="2"/>
                 <c:pt idx="0">
-                  <c:v>46262.04824074074</c:v>
+                  <c:v>46262.03627314815</c:v>
                 </c:pt>
                 <c:pt idx="1">
-                  <c:v>46262.061215277776</c:v>
+                  <c:v>46264.81765046297</c:v>
+                </c:pt>
+                <c:pt idx="2">
+                  <c:v>46264.8278125</c:v>
+                </c:pt>
+                <c:pt idx="3">
+                  <c:v>46264.83329861111</c:v>
+                </c:pt>
+                <c:pt idx="4">
+                  <c:v>46264.84984953704</c:v>
+                </c:pt>
+                <c:pt idx="5">
+                  <c:v>46264.85894675926</c:v>
                 </c:pt>
               </c:numCache>
             </c:numRef>
@@ -9984,6 +9486,18 @@
                 </c:pt>
                 <c:pt idx="1">
                   <c:v>0.1</c:v>
+                </c:pt>
+                <c:pt idx="2">
+                  <c:v>0.0</c:v>
+                </c:pt>
+                <c:pt idx="3">
+                  <c:v>0.0</c:v>
+                </c:pt>
+                <c:pt idx="4">
+                  <c:v>0.0</c:v>
+                </c:pt>
+                <c:pt idx="5">
+                  <c:v>0.0</c:v>
                 </c:pt>
               </c:numCache>
             </c:numRef>

</xml_diff>